<commit_message>
Nota metodológica confirmada por ambos autores
</commit_message>
<xml_diff>
--- a/VC-2026-005-041_NotaMetodologica.docx
+++ b/VC-2026-005-041_NotaMetodologica.docx
@@ -35,28 +35,7 @@
         <w:br/>
         <w:t xml:space="preserve">Vibe Coding CEDIA 2026 · Módulo 5 · Lección R5.3 · Guías de proyecto 21 y 08</w:t>
         <w:br/>
-        <w:t xml:space="preserve">Versión de la nota: 2026-10-14 · Estado: revisada y confirmada por Martha Agila Palacios; </w:t>
-      </w:r>
-      <w:r>
-        <w:rPr>
-          <w:rFonts w:ascii="Arial" w:hAnsi="Arial" w:cs="Arial"/>
-          <w:sz w:val="29"/>
-          <w:sz-cs w:val="29"/>
-          <w:b/>
-          <w:spacing w:val="0"/>
-          <w:color w:val="862410"/>
-        </w:rPr>
-        <w:t xml:space="preserve">confirmación de Rodrigo Proaño pendiente</w:t>
-      </w:r>
-      <w:r>
-        <w:rPr>
-          <w:rFonts w:ascii="Arial" w:hAnsi="Arial" w:cs="Arial"/>
-          <w:sz w:val="29"/>
-          <w:sz-cs w:val="29"/>
-          <w:spacing w:val="0"/>
-          <w:color w:val="3B4350"/>
-        </w:rPr>
-        <w:t xml:space="preserve"/>
+        <w:t xml:space="preserve">Versión de la nota: 2026-10-14 · Estado: revisada y confirmada por Martha Agila Palacios y Rodrigo Proaño Escalante</w:t>
       </w:r>
     </w:p>
     <w:p>
@@ -1578,27 +1557,7 @@
           <w:sz-cs w:val="26"/>
           <w:spacing w:val="0"/>
         </w:rPr>
-        <w:t xml:space="preserve">Martha Agila Palacios: ruta Investigar y sitio integrado. Rodrigo Proaño Escalante: sitio del curso de la guía 21. Asignación aprobada por Martha Agila el 2026-10-14; </w:t>
-      </w:r>
-      <w:r>
-        <w:rPr>
-          <w:rFonts w:ascii="Arial" w:hAnsi="Arial" w:cs="Arial"/>
-          <w:sz w:val="26"/>
-          <w:sz-cs w:val="26"/>
-          <w:b/>
-          <w:spacing w:val="0"/>
-          <w:color w:val="862410"/>
-        </w:rPr>
-        <w:t xml:space="preserve">aceptación de Rodrigo Proaño pendiente</w:t>
-      </w:r>
-      <w:r>
-        <w:rPr>
-          <w:rFonts w:ascii="Arial" w:hAnsi="Arial" w:cs="Arial"/>
-          <w:sz w:val="26"/>
-          <w:sz-cs w:val="26"/>
-          <w:spacing w:val="0"/>
-        </w:rPr>
-        <w:t xml:space="preserve">.</w:t>
+        <w:t xml:space="preserve">Martha Agila Palacios: ruta Investigar y sitio integrado. Rodrigo Proaño Escalante: sitio del curso de la guía 21. Asignación aceptada por ambos autores el 2026-10-14.</w:t>
       </w:r>
     </w:p>
     <w:p>
@@ -1748,66 +1707,6 @@
           <w:spacing w:val="0"/>
         </w:rPr>
         <w:t xml:space="preserve">Pendientes</w:t>
-      </w:r>
-    </w:p>
-    <w:p>
-      <w:pPr>
-        <w:ind w:left="720" w:first-line="-720"/>
-      </w:pPr>
-      <w:r>
-        <w:rPr>
-          <w:rFonts w:ascii="Arial" w:hAnsi="Arial" w:cs="Arial"/>
-          <w:sz w:val="29"/>
-          <w:sz-cs w:val="29"/>
-          <w:b/>
-          <w:color w:val="862410"/>
-        </w:rPr>
-        <w:t xml:space="preserve"/>
-        <w:tab/>
-        <w:t xml:space="preserve">•</w:t>
-        <w:tab/>
-        <w:t xml:space="preserve"/>
-      </w:r>
-      <w:r>
-        <w:rPr>
-          <w:rFonts w:ascii="Arial" w:hAnsi="Arial" w:cs="Arial"/>
-          <w:sz w:val="29"/>
-          <w:sz-cs w:val="29"/>
-          <w:b/>
-          <w:spacing w:val="0"/>
-          <w:color w:val="862410"/>
-        </w:rPr>
-        <w:t xml:space="preserve">Confirmación de la nota por Rodrigo Proaño.</w:t>
-      </w:r>
-    </w:p>
-    <w:p>
-      <w:pPr>
-        <w:ind w:left="720" w:first-line="-720"/>
-      </w:pPr>
-      <w:r>
-        <w:rPr>
-          <w:rFonts w:ascii="Arial" w:hAnsi="Arial" w:cs="Arial"/>
-          <w:sz w:val="29"/>
-          <w:sz-cs w:val="29"/>
-          <w:b/>
-          <w:color w:val="862410"/>
-        </w:rPr>
-        <w:t xml:space="preserve"/>
-        <w:tab/>
-        <w:t xml:space="preserve">•</w:t>
-        <w:tab/>
-        <w:t xml:space="preserve"/>
-      </w:r>
-      <w:r>
-        <w:rPr>
-          <w:rFonts w:ascii="Arial" w:hAnsi="Arial" w:cs="Arial"/>
-          <w:sz w:val="29"/>
-          <w:sz-cs w:val="29"/>
-          <w:b/>
-          <w:spacing w:val="0"/>
-          <w:color w:val="862410"/>
-        </w:rPr>
-        <w:t xml:space="preserve">Aceptación del rol de mantenimiento por Rodrigo Proaño.</w:t>
       </w:r>
     </w:p>
     <w:p>

</xml_diff>